<commit_message>
Experteam : e-Note de crédit décrit (solution RPA + Power Platform, rôle de développement), use cases resserré
Co-Authored-By: Claude Opus 5.5 <noreply@anthropic.com>
Claude-Session: https://claude.ai/code/session_01Uwm2tAGtUGTnWWMUSVQkub
</commit_message>
<xml_diff>
--- a/output/CV_NicolasQiGUO_Experteam.docx
+++ b/output/CV_NicolasQiGUO_Experteam.docx
@@ -314,7 +314,7 @@
           <w:sz w:val="19"/>
           <w:u w:val="none"/>
         </w:rPr>
-        <w:t>conception et mise en place d'un dispositif de collecte, de qualification et de priorisation des use cases ; 20+ use cases identifiés, dont 3 retenus et lancés en projet</w:t>
+        <w:t>conception et mise en place d'un dispositif de collecte, qualification et priorisation des use cases ; 20+ use cases identifiés, 3 lancés en projet</w:t>
       </w:r>
     </w:p>
     <w:p>
@@ -624,7 +624,7 @@
           <w:sz w:val="19"/>
           <w:u w:val="none"/>
         </w:rPr>
-        <w:t>Développement low-code (Power Apps, Power Automate, SharePoint), recette et mise en production</w:t>
+        <w:t>Pilotage du développement, de la recette et de la mise en production</w:t>
       </w:r>
     </w:p>
     <w:p>
@@ -723,7 +723,7 @@
           <w:sz w:val="19"/>
           <w:u w:val="none"/>
         </w:rPr>
-        <w:t xml:space="preserve">Projet e-Note de crédit : </w:t>
+        <w:t xml:space="preserve">Projet e-Note de crédit </w:t>
       </w:r>
       <w:r>
         <w:rPr>
@@ -734,7 +734,7 @@
           <w:sz w:val="19"/>
           <w:u w:val="none"/>
         </w:rPr>
-        <w:t>traitement de plusieurs semaines à quasi instantané, impact financier &gt; 700 k€</w:t>
+        <w:t>(digitalisation des notes de crédit, RPA + Power Platform) : développement de toute la partie Power Platform – interface Power Apps et flux Power Automate reliant les briques (RPA, SharePoint) ; délai de plusieurs semaines à quasi instantané, impact &gt; 700 k€</w:t>
       </w:r>
     </w:p>
     <w:p>

</xml_diff>

<commit_message>
Harmonisation : Agile en notions et Pack Office / Teams dans toutes les versions
- build_cv.py : « risques – Cycle en V, hybride, Agile (notions) » ;
  outils « Pack Office, Teams, SharePoint, Power Apps, Power Automate, Power BI »
- Viveris, Experteam, Orano alignés ; remplacements devenus inutiles retirés
  (Sopra, Hôpital, Double compétence)
- toutes les versions régénérées, chacune sur une page

Co-Authored-By: Claude Opus 5.5 <noreply@anthropic.com>
Claude-Session: https://claude.ai/code/session_01Uwm2tAGtUGTnWWMUSVQkub
</commit_message>
<xml_diff>
--- a/output/CV_NicolasQiGUO_Experteam.docx
+++ b/output/CV_NicolasQiGUO_Experteam.docx
@@ -1266,7 +1266,7 @@
           <w:u w:val="none"/>
         </w:rPr>
         <w:tab/>
-        <w:t>Power Apps, Power Automate, SharePoint (listes, sites), Teams, Copilot</w:t>
+        <w:t>Pack Office, Teams, SharePoint (listes, sites), Power Apps, Power Automate, Copilot</w:t>
       </w:r>
     </w:p>
     <w:p>
@@ -1323,7 +1323,7 @@
         <w:tab/>
         <w:t>Cadrage, ateliers métiers, spécifications, recette, mise en production</w:t>
         <w:br/>
-        <w:t>Documentation et formation utilisateurs, COPIL / COSUI – Agile, cycle en V</w:t>
+        <w:t>Formation utilisateurs, COPIL / COSUI – Cycle en V, Agile (notions)</w:t>
       </w:r>
     </w:p>
     <w:p>

</xml_diff>